<commit_message>
Fix generated table indents and safety case cover layout
</commit_message>
<xml_diff>
--- a/templates/ОБ_нефтяная_скважина/OB_neft_well.docx
+++ b/templates/ОБ_нефтяная_скважина/OB_neft_well.docx
@@ -4,38 +4,6 @@
   <w:body>
     <w:p>
       <w:pPr>
-        <w:ind w:firstLine="0"/>
-        <w:jc w:val="center"/>
-        <w:rPr>
-          <w:lang w:val="en-US"/>
-        </w:rPr>
-      </w:pPr>
-      <w:r>
-        <w:rPr>
-          <w:b/>
-          <w:lang w:val="en-US"/>
-        </w:rPr>
-        <w:t>{{EXECUTOR_NAME}}</w:t>
-      </w:r>
-    </w:p>
-    <w:p>
-      <w:pPr>
-        <w:ind w:firstLine="0"/>
-        <w:jc w:val="center"/>
-        <w:rPr>
-          <w:lang w:val="en-US"/>
-        </w:rPr>
-      </w:pPr>
-      <w:r>
-        <w:rPr>
-          <w:sz w:val="20"/>
-          <w:lang w:val="en-US"/>
-        </w:rPr>
-        <w:t>{{EXECUTOR_ADDRESS}}</w:t>
-      </w:r>
-    </w:p>
-    <w:p>
-      <w:pPr>
         <w:spacing w:before="320"/>
         <w:ind w:firstLine="0"/>
         <w:jc w:val="right"/>
@@ -194,6 +162,22 @@
       </w:pPr>
       <w:r>
         <w:t>Разработчик обоснования безопасности: {{EXECUTOR_NAME}}</w:t>
+      </w:r>
+    </w:p>
+    <w:p>
+      <w:pPr>
+        <w:ind w:firstLine="0"/>
+        <w:jc w:val="left"/>
+        <w:rPr>
+          <w:lang w:val="en-US"/>
+        </w:rPr>
+      </w:pPr>
+      <w:r>
+        <w:rPr>
+          <w:sz w:val="20"/>
+          <w:lang w:val="en-US"/>
+        </w:rPr>
+        <w:t>{{EXECUTOR_ADDRESS}}</w:t>
       </w:r>
     </w:p>
     <w:p>

</xml_diff>